<commit_message>
Fix legal contract: Google Drive button, BIK bullet, double /кор, employee passport issue date, room count and additional conditions formatting
- Show "Отправить на Google Drive" button after generation when configured (was missing for legal flow)
- Remove stray bullet point before БИК in requisites table
- Remove duplicate literal "/кор" after CONTRACT_NUMBER (title and Appendix 1) — the number already includes the suffix
- extract_foreign_passport now returns issue_date, filling the empty "Даты выдачи" column for employees in Appendix 1
- Room count "½" now shows "(при двухместном размещении)" like the individual contract
- Additional conditions in Appendix 1 now use a single auto-sizing field without doubled dashes, matching the individual contract
</commit_message>
<xml_diff>
--- a/templates/contract_legal.docx
+++ b/templates/contract_legal.docx
@@ -42,7 +42,7 @@
           <w:color w:val="000000"/>
           <w:rtl w:val="0"/>
         </w:rPr>
-        <w:t xml:space="preserve"> ТУРИСТИЧЕСКИЕ УСЛУГИ С ТУРАГЕНТОМ № 1</w:t>
+        <w:t xml:space="preserve"> ТУРИСТИЧЕСКИЕ УСЛУГИ С ТУРАГЕНТОМ № </w:t>
       </w:r>
       <w:r>
         <w:rPr>
@@ -58,7 +58,6 @@
           <w:bCs w:val="1"/>
           <w:rtl w:val="0"/>
         </w:rPr>
-        <w:t xml:space="preserve">/кор</w:t>
       </w:r>
       <w:r>
         <w:rPr>
@@ -3059,10 +3058,6 @@
           </w:p>
           <w:p>
             <w:pPr>
-              <w:numPr>
-                <w:ilvl w:val="0"/>
-                <w:numId w:val="1"/>
-              </w:numPr>
               <w:pBdr>
                 <w:top w:space="0" w:sz="0" w:val="nil"/>
                 <w:left w:space="0" w:sz="0" w:val="nil"/>
@@ -3070,7 +3065,6 @@
                 <w:right w:space="0" w:sz="0" w:val="nil"/>
                 <w:between w:space="0" w:sz="0" w:val="nil"/>
               </w:pBdr>
-              <w:ind w:left="720" w:hanging="360"/>
               <w:rPr>
                 <w:u w:val="none"/>
               </w:rPr>
@@ -3422,7 +3416,6 @@
           <w:szCs w:val="18"/>
           <w:rtl w:val="0"/>
         </w:rPr>
-        <w:t xml:space="preserve">/кор</w:t>
       </w:r>
       <w:r>
         <w:rPr>
@@ -5296,7 +5289,7 @@
       <w:tr>
         <w:trPr>
           <w:cantSplit w:val="0"/>
-          <w:trHeight w:val="2612" w:hRule="atLeast"/>
+          <w:trHeight w:val="381" w:hRule="atLeast"/>
           <w:tblHeader w:val="0"/>
         </w:trPr>
         <w:tc>
@@ -5412,311 +5405,7 @@
                 <w:szCs w:val="18"/>
                 <w:rtl w:val="0"/>
               </w:rPr>
-              <w:t xml:space="preserve">-</w:t>
-            </w:r>
-            <w:r>
-              <w:rPr>
-                <w:sz w:val="14"/>
-                <w:szCs w:val="14"/>
-                <w:rtl w:val="0"/>
-              </w:rPr>
-              <w:t xml:space="preserve">        </w:t>
-            </w:r>
-            <w:r>
-              <w:rPr>
-                <w:sz w:val="18"/>
-                <w:szCs w:val="18"/>
-                <w:rtl w:val="0"/>
-              </w:rPr>
               <w:t>{{ADD_COND_1}}</w:t>
-            </w:r>
-          </w:p>
-          <w:p>
-            <w:pPr>
-              <w:rPr>
-                <w:sz w:val="18"/>
-                <w:szCs w:val="18"/>
-              </w:rPr>
-            </w:pPr>
-            <w:r>
-              <w:rPr>
-                <w:sz w:val="18"/>
-                <w:szCs w:val="18"/>
-                <w:rtl w:val="0"/>
-              </w:rPr>
-              <w:t>{{ADD_COND_2}}</w:t>
-            </w:r>
-          </w:p>
-          <w:p>
-            <w:pPr>
-              <w:rPr>
-                <w:sz w:val="18"/>
-                <w:szCs w:val="18"/>
-              </w:rPr>
-            </w:pPr>
-            <w:r>
-              <w:rPr>
-                <w:sz w:val="18"/>
-                <w:szCs w:val="18"/>
-                <w:rtl w:val="0"/>
-              </w:rPr>
-              <w:t xml:space="preserve">-</w:t>
-            </w:r>
-            <w:r>
-              <w:rPr>
-                <w:sz w:val="14"/>
-                <w:szCs w:val="14"/>
-                <w:rtl w:val="0"/>
-              </w:rPr>
-              <w:t xml:space="preserve">        </w:t>
-            </w:r>
-            <w:r>
-              <w:rPr>
-                <w:sz w:val="18"/>
-                <w:szCs w:val="18"/>
-                <w:rtl w:val="0"/>
-              </w:rPr>
-              <w:t>{{ADD_COND_3}}</w:t>
-            </w:r>
-          </w:p>
-          <w:p>
-            <w:pPr>
-              <w:rPr>
-                <w:sz w:val="18"/>
-                <w:szCs w:val="18"/>
-              </w:rPr>
-            </w:pPr>
-            <w:r>
-              <w:rPr>
-                <w:sz w:val="18"/>
-                <w:szCs w:val="18"/>
-                <w:rtl w:val="0"/>
-              </w:rPr>
-              <w:t xml:space="preserve">-</w:t>
-            </w:r>
-            <w:r>
-              <w:rPr>
-                <w:sz w:val="14"/>
-                <w:szCs w:val="14"/>
-                <w:rtl w:val="0"/>
-              </w:rPr>
-              <w:t xml:space="preserve">        </w:t>
-            </w:r>
-            <w:r>
-              <w:rPr>
-                <w:sz w:val="18"/>
-                <w:szCs w:val="18"/>
-                <w:rtl w:val="0"/>
-              </w:rPr>
-              <w:t>{{ADD_COND_4}}</w:t>
-            </w:r>
-          </w:p>
-          <w:p>
-            <w:pPr>
-              <w:rPr>
-                <w:sz w:val="18"/>
-                <w:szCs w:val="18"/>
-              </w:rPr>
-            </w:pPr>
-            <w:r>
-              <w:rPr>
-                <w:sz w:val="18"/>
-                <w:szCs w:val="18"/>
-                <w:rtl w:val="0"/>
-              </w:rPr>
-              <w:t xml:space="preserve">-</w:t>
-            </w:r>
-            <w:r>
-              <w:rPr>
-                <w:sz w:val="14"/>
-                <w:szCs w:val="14"/>
-                <w:rtl w:val="0"/>
-              </w:rPr>
-              <w:t xml:space="preserve">        </w:t>
-            </w:r>
-            <w:r>
-              <w:rPr>
-                <w:sz w:val="18"/>
-                <w:szCs w:val="18"/>
-                <w:rtl w:val="0"/>
-              </w:rPr>
-              <w:t>{{ADD_COND_5}}</w:t>
-            </w:r>
-          </w:p>
-          <w:p>
-            <w:pPr>
-              <w:rPr>
-                <w:sz w:val="18"/>
-                <w:szCs w:val="18"/>
-              </w:rPr>
-            </w:pPr>
-            <w:r>
-              <w:rPr>
-                <w:sz w:val="18"/>
-                <w:szCs w:val="18"/>
-                <w:rtl w:val="0"/>
-              </w:rPr>
-              <w:t xml:space="preserve">-</w:t>
-            </w:r>
-            <w:r>
-              <w:rPr>
-                <w:sz w:val="14"/>
-                <w:szCs w:val="14"/>
-                <w:rtl w:val="0"/>
-              </w:rPr>
-              <w:t xml:space="preserve">        </w:t>
-            </w:r>
-            <w:r>
-              <w:rPr>
-                <w:sz w:val="18"/>
-                <w:szCs w:val="18"/>
-                <w:rtl w:val="0"/>
-              </w:rPr>
-              <w:t>{{ADD_COND_6}}</w:t>
-            </w:r>
-          </w:p>
-          <w:p>
-            <w:pPr>
-              <w:rPr>
-                <w:sz w:val="18"/>
-                <w:szCs w:val="18"/>
-              </w:rPr>
-            </w:pPr>
-            <w:r>
-              <w:rPr>
-                <w:sz w:val="18"/>
-                <w:szCs w:val="18"/>
-                <w:rtl w:val="0"/>
-              </w:rPr>
-              <w:t xml:space="preserve">-</w:t>
-            </w:r>
-            <w:r>
-              <w:rPr>
-                <w:sz w:val="14"/>
-                <w:szCs w:val="14"/>
-                <w:rtl w:val="0"/>
-              </w:rPr>
-              <w:t xml:space="preserve">        </w:t>
-            </w:r>
-            <w:r>
-              <w:rPr>
-                <w:sz w:val="18"/>
-                <w:szCs w:val="18"/>
-                <w:rtl w:val="0"/>
-              </w:rPr>
-              <w:t>{{ADD_COND_7}}</w:t>
-            </w:r>
-          </w:p>
-          <w:p>
-            <w:pPr>
-              <w:rPr>
-                <w:sz w:val="18"/>
-                <w:szCs w:val="18"/>
-              </w:rPr>
-            </w:pPr>
-            <w:r>
-              <w:rPr>
-                <w:sz w:val="18"/>
-                <w:szCs w:val="18"/>
-                <w:rtl w:val="0"/>
-              </w:rPr>
-              <w:t xml:space="preserve">-</w:t>
-            </w:r>
-            <w:r>
-              <w:rPr>
-                <w:sz w:val="14"/>
-                <w:szCs w:val="14"/>
-                <w:rtl w:val="0"/>
-              </w:rPr>
-              <w:t xml:space="preserve">        </w:t>
-            </w:r>
-            <w:r>
-              <w:rPr>
-                <w:sz w:val="18"/>
-                <w:szCs w:val="18"/>
-                <w:rtl w:val="0"/>
-              </w:rPr>
-              <w:t>{{ADD_COND_8}}</w:t>
-            </w:r>
-          </w:p>
-          <w:p>
-            <w:pPr>
-              <w:rPr>
-                <w:sz w:val="18"/>
-                <w:szCs w:val="18"/>
-              </w:rPr>
-            </w:pPr>
-            <w:r>
-              <w:rPr>
-                <w:sz w:val="18"/>
-                <w:szCs w:val="18"/>
-                <w:rtl w:val="0"/>
-              </w:rPr>
-              <w:t xml:space="preserve">-</w:t>
-            </w:r>
-            <w:r>
-              <w:rPr>
-                <w:sz w:val="14"/>
-                <w:szCs w:val="14"/>
-                <w:rtl w:val="0"/>
-              </w:rPr>
-              <w:t xml:space="preserve">        </w:t>
-            </w:r>
-            <w:r>
-              <w:rPr>
-                <w:sz w:val="18"/>
-                <w:szCs w:val="18"/>
-                <w:rtl w:val="0"/>
-              </w:rPr>
-              <w:t>{{ADD_COND_9}}</w:t>
-            </w:r>
-          </w:p>
-          <w:p>
-            <w:pPr>
-              <w:rPr>
-                <w:sz w:val="18"/>
-                <w:szCs w:val="18"/>
-              </w:rPr>
-            </w:pPr>
-            <w:r>
-              <w:rPr>
-                <w:sz w:val="18"/>
-                <w:szCs w:val="18"/>
-                <w:rtl w:val="0"/>
-              </w:rPr>
-              <w:t xml:space="preserve">-</w:t>
-            </w:r>
-            <w:r>
-              <w:rPr>
-                <w:sz w:val="14"/>
-                <w:szCs w:val="14"/>
-                <w:rtl w:val="0"/>
-              </w:rPr>
-              <w:t xml:space="preserve">        </w:t>
-            </w:r>
-            <w:r>
-              <w:rPr>
-                <w:sz w:val="18"/>
-                <w:szCs w:val="18"/>
-                <w:rtl w:val="0"/>
-              </w:rPr>
-              <w:t>{{ADD_COND_10}}</w:t>
-            </w:r>
-          </w:p>
-          <w:p>
-            <w:pPr>
-              <w:rPr>
-                <w:sz w:val="18"/>
-                <w:szCs w:val="18"/>
-              </w:rPr>
-            </w:pPr>
-            <w:r>
-              <w:rPr>
-                <w:sz w:val="18"/>
-                <w:szCs w:val="18"/>
-                <w:rtl w:val="0"/>
-              </w:rPr>
-              <w:t>{{ADD_COND_11}}</w:t>
             </w:r>
           </w:p>
         </w:tc>

</xml_diff>